<commit_message>
docs: corrige o acesso do cliente no manual (#49)
Semear o banco com dados reais mostrou que o texto estava errado: o
código de acesso que o sistema gera tem 32 caracteres, e a tela inicial
do cliente só aceita 6. Pelo QR funciona; digitado, não.

O manual passa a descrever o que o sistema faz hoje e aponta a #217, que
tem as opções de correção.
</commit_message>
<xml_diff>
--- a/docs/manual-usuario/GASTRA_Manual_do_Usuario.docx
+++ b/docs/manual-usuario/GASTRA_Manual_do_Usuario.docx
@@ -2737,7 +2737,21 @@
         <w:t>QR code da mesa</w:t>
       </w:r>
       <w:r>
-        <w:t xml:space="preserve"> com a câmera do celular, ou digita o código que está na mesa. A tela inicial oferece duas coisas: ver o cardápio ou acompanhar a conta.</w:t>
+        <w:t xml:space="preserve"> com a câmera do celular. A tela inicial oferece duas coisas: ver o cardápio ou acompanhar a conta.</w:t>
+      </w:r>
+    </w:p>
+    <w:p>
+      <w:r>
+        <w:t xml:space="preserve">&gt; </w:t>
+      </w:r>
+      <w:r>
+        <w:rPr>
+          <w:b/>
+        </w:rPr>
+        <w:t>Hoje só o QR funciona.</w:t>
+      </w:r>
+      <w:r>
+        <w:t xml:space="preserve"> A tela tem um campo para digitar o código da mesa, mas ele espera um código de seis &gt; caracteres, e o que o sistema gera hoje tem trinta e dois. Enquanto a [#217](https://github.com/danih-vb/gastra-tg/issues/217) &gt; não for resolvida, quem não conseguir ler o QR precisa pedir ajuda ao garçom.</w:t>
       </w:r>
     </w:p>
     <w:p>
@@ -2984,7 +2998,7 @@
       <w:tr>
         <w:tc>
           <w:tcPr>
-            <w:tcW w:type="dxa" w:w="3252"/>
+            <w:tcW w:type="dxa" w:w="1655"/>
             <w:shd w:val="clear" w:color="auto" w:fill="DCE3EE"/>
           </w:tcPr>
           <w:p>
@@ -2999,7 +3013,7 @@
         </w:tc>
         <w:tc>
           <w:tcPr>
-            <w:tcW w:type="dxa" w:w="3133"/>
+            <w:tcW w:type="dxa" w:w="1536"/>
             <w:shd w:val="clear" w:color="auto" w:fill="DCE3EE"/>
           </w:tcPr>
           <w:p>
@@ -3014,7 +3028,7 @@
         </w:tc>
         <w:tc>
           <w:tcPr>
-            <w:tcW w:type="dxa" w:w="3252"/>
+            <w:tcW w:type="dxa" w:w="6894"/>
             <w:shd w:val="clear" w:color="auto" w:fill="DCE3EE"/>
           </w:tcPr>
           <w:p>
@@ -3031,7 +3045,7 @@
       <w:tr>
         <w:tc>
           <w:tcPr>
-            <w:tcW w:type="dxa" w:w="3252"/>
+            <w:tcW w:type="dxa" w:w="1655"/>
           </w:tcPr>
           <w:p>
             <w:r>
@@ -3044,7 +3058,7 @@
         </w:tc>
         <w:tc>
           <w:tcPr>
-            <w:tcW w:type="dxa" w:w="3133"/>
+            <w:tcW w:type="dxa" w:w="1536"/>
           </w:tcPr>
           <w:p>
             <w:r>
@@ -3057,7 +3071,7 @@
         </w:tc>
         <w:tc>
           <w:tcPr>
-            <w:tcW w:type="dxa" w:w="3252"/>
+            <w:tcW w:type="dxa" w:w="6894"/>
           </w:tcPr>
           <w:p>
             <w:r>
@@ -3072,7 +3086,7 @@
       <w:tr>
         <w:tc>
           <w:tcPr>
-            <w:tcW w:type="dxa" w:w="3252"/>
+            <w:tcW w:type="dxa" w:w="1655"/>
           </w:tcPr>
           <w:p>
             <w:r>
@@ -3085,7 +3099,7 @@
         </w:tc>
         <w:tc>
           <w:tcPr>
-            <w:tcW w:type="dxa" w:w="3133"/>
+            <w:tcW w:type="dxa" w:w="1536"/>
           </w:tcPr>
           <w:p>
             <w:r>
@@ -3098,7 +3112,7 @@
         </w:tc>
         <w:tc>
           <w:tcPr>
-            <w:tcW w:type="dxa" w:w="3252"/>
+            <w:tcW w:type="dxa" w:w="6894"/>
           </w:tcPr>
           <w:p>
             <w:r>
@@ -3113,7 +3127,7 @@
       <w:tr>
         <w:tc>
           <w:tcPr>
-            <w:tcW w:type="dxa" w:w="3252"/>
+            <w:tcW w:type="dxa" w:w="1655"/>
           </w:tcPr>
           <w:p>
             <w:r>
@@ -3126,7 +3140,7 @@
         </w:tc>
         <w:tc>
           <w:tcPr>
-            <w:tcW w:type="dxa" w:w="3133"/>
+            <w:tcW w:type="dxa" w:w="1536"/>
           </w:tcPr>
           <w:p>
             <w:r>
@@ -3139,7 +3153,7 @@
         </w:tc>
         <w:tc>
           <w:tcPr>
-            <w:tcW w:type="dxa" w:w="3252"/>
+            <w:tcW w:type="dxa" w:w="6894"/>
           </w:tcPr>
           <w:p>
             <w:r>
@@ -3154,7 +3168,7 @@
       <w:tr>
         <w:tc>
           <w:tcPr>
-            <w:tcW w:type="dxa" w:w="3252"/>
+            <w:tcW w:type="dxa" w:w="1655"/>
           </w:tcPr>
           <w:p>
             <w:r>
@@ -3167,7 +3181,7 @@
         </w:tc>
         <w:tc>
           <w:tcPr>
-            <w:tcW w:type="dxa" w:w="3133"/>
+            <w:tcW w:type="dxa" w:w="1536"/>
           </w:tcPr>
           <w:p>
             <w:r>
@@ -3180,7 +3194,7 @@
         </w:tc>
         <w:tc>
           <w:tcPr>
-            <w:tcW w:type="dxa" w:w="3252"/>
+            <w:tcW w:type="dxa" w:w="6894"/>
           </w:tcPr>
           <w:p>
             <w:r>
@@ -3195,7 +3209,7 @@
       <w:tr>
         <w:tc>
           <w:tcPr>
-            <w:tcW w:type="dxa" w:w="3252"/>
+            <w:tcW w:type="dxa" w:w="1655"/>
           </w:tcPr>
           <w:p>
             <w:r>
@@ -3208,7 +3222,7 @@
         </w:tc>
         <w:tc>
           <w:tcPr>
-            <w:tcW w:type="dxa" w:w="3133"/>
+            <w:tcW w:type="dxa" w:w="1536"/>
           </w:tcPr>
           <w:p>
             <w:r>
@@ -3221,7 +3235,7 @@
         </w:tc>
         <w:tc>
           <w:tcPr>
-            <w:tcW w:type="dxa" w:w="3252"/>
+            <w:tcW w:type="dxa" w:w="6894"/>
           </w:tcPr>
           <w:p>
             <w:r>
@@ -3236,7 +3250,7 @@
       <w:tr>
         <w:tc>
           <w:tcPr>
-            <w:tcW w:type="dxa" w:w="3252"/>
+            <w:tcW w:type="dxa" w:w="1655"/>
           </w:tcPr>
           <w:p>
             <w:r>
@@ -3249,7 +3263,7 @@
         </w:tc>
         <w:tc>
           <w:tcPr>
-            <w:tcW w:type="dxa" w:w="3133"/>
+            <w:tcW w:type="dxa" w:w="1536"/>
           </w:tcPr>
           <w:p>
             <w:r>
@@ -3262,7 +3276,7 @@
         </w:tc>
         <w:tc>
           <w:tcPr>
-            <w:tcW w:type="dxa" w:w="3252"/>
+            <w:tcW w:type="dxa" w:w="6894"/>
           </w:tcPr>
           <w:p>
             <w:r>
@@ -3277,7 +3291,7 @@
       <w:tr>
         <w:tc>
           <w:tcPr>
-            <w:tcW w:type="dxa" w:w="3252"/>
+            <w:tcW w:type="dxa" w:w="1655"/>
           </w:tcPr>
           <w:p>
             <w:r>
@@ -3290,27 +3304,27 @@
         </w:tc>
         <w:tc>
           <w:tcPr>
-            <w:tcW w:type="dxa" w:w="3133"/>
+            <w:tcW w:type="dxa" w:w="1536"/>
           </w:tcPr>
           <w:p>
             <w:r>
               <w:rPr>
                 <w:sz w:val="18"/>
               </w:rPr>
-              <w:t>O código digitado não existe ou a conta já fechou</w:t>
+              <w:t>O código não existe ou a conta já fechou</w:t>
             </w:r>
           </w:p>
         </w:tc>
         <w:tc>
           <w:tcPr>
-            <w:tcW w:type="dxa" w:w="3252"/>
+            <w:tcW w:type="dxa" w:w="6894"/>
           </w:tcPr>
           <w:p>
             <w:r>
               <w:rPr>
                 <w:sz w:val="18"/>
               </w:rPr>
-              <w:t>Confira o código na mesa ou chame o garçom</w:t>
+              <w:t>Leia o QR de novo ou chame o garçom. Digitar o código ainda não funciona: ver [#217](https://github.com/danih-vb/gastra-tg/issues/217)</w:t>
             </w:r>
           </w:p>
         </w:tc>
@@ -3318,7 +3332,7 @@
       <w:tr>
         <w:tc>
           <w:tcPr>
-            <w:tcW w:type="dxa" w:w="3252"/>
+            <w:tcW w:type="dxa" w:w="1655"/>
           </w:tcPr>
           <w:p>
             <w:r>
@@ -3331,7 +3345,7 @@
         </w:tc>
         <w:tc>
           <w:tcPr>
-            <w:tcW w:type="dxa" w:w="3133"/>
+            <w:tcW w:type="dxa" w:w="1536"/>
           </w:tcPr>
           <w:p>
             <w:r>
@@ -3344,7 +3358,7 @@
         </w:tc>
         <w:tc>
           <w:tcPr>
-            <w:tcW w:type="dxa" w:w="3252"/>
+            <w:tcW w:type="dxa" w:w="6894"/>
           </w:tcPr>
           <w:p>
             <w:r>
@@ -3359,7 +3373,7 @@
       <w:tr>
         <w:tc>
           <w:tcPr>
-            <w:tcW w:type="dxa" w:w="3252"/>
+            <w:tcW w:type="dxa" w:w="1655"/>
           </w:tcPr>
           <w:p>
             <w:r>
@@ -3372,7 +3386,7 @@
         </w:tc>
         <w:tc>
           <w:tcPr>
-            <w:tcW w:type="dxa" w:w="3133"/>
+            <w:tcW w:type="dxa" w:w="1536"/>
           </w:tcPr>
           <w:p>
             <w:r>
@@ -3385,7 +3399,7 @@
         </w:tc>
         <w:tc>
           <w:tcPr>
-            <w:tcW w:type="dxa" w:w="3252"/>
+            <w:tcW w:type="dxa" w:w="6894"/>
           </w:tcPr>
           <w:p>
             <w:r>

</xml_diff>

<commit_message>
feat(indicadores): avaliação do cliente no índice de desempenho do garçom
- Índice 40/30/30 (faturamento, mesas, avaliação) quando algum garçom tem 5+ avaliações no período;
  sem isso, 50/50 como antes.
- Mínimo de 5 avaliações por garçom (RN08): abaixo disso a nota não é usada nem mostrada, entra a média geral.
- Média bayesiana (5 avaliações na média geral) para poucas notas altas não passarem muitas quase tão altas.
- Consulta ObterAvaliacoesPorGarcom, testada no MySQL.
- Telas do Gerente e do Garçom mostram a nota e o peso; manual atualizado.

Refs #232
</commit_message>
<xml_diff>
--- a/docs/manual-usuario/GASTRA_Manual_do_Usuario.docx
+++ b/docs/manual-usuario/GASTRA_Manual_do_Usuario.docx
@@ -1630,7 +1630,7 @@
     </w:p>
     <w:p>
       <w:r>
-        <w:t xml:space="preserve">Cada garçom vê a própria posição no ranking do período, com o faturamento por turno e a média de mesas atendidas. O garçom vê </w:t>
+        <w:t xml:space="preserve">Cada garçom vê a própria posição no ranking do período, com o faturamento por turno, a média de mesas atendidas e, quando há avaliações suficientes, a nota dos clientes. O garçom vê </w:t>
       </w:r>
       <w:r>
         <w:rPr>
@@ -1640,6 +1640,26 @@
       </w:r>
       <w:r>
         <w:t xml:space="preserve"> e a posição; não vê o desempenho dos colegas.</w:t>
+      </w:r>
+    </w:p>
+    <w:p>
+      <w:r>
+        <w:rPr>
+          <w:b/>
+        </w:rPr>
+        <w:t>Como a avaliação entra no índice.</w:t>
+      </w:r>
+      <w:r>
+        <w:t xml:space="preserve"> Quando algum garçom recebeu pelo menos 5 avaliações no período, o índice passa a ser 40% faturamento, 30% mesas e 30% avaliação. A nota considerada é uma média que puxa quem tem poucas avaliações para a média do restaurante, para poucas notas altas não valerem mais que muitas notas quase tão altas. Quem teve </w:t>
+      </w:r>
+      <w:r>
+        <w:rPr>
+          <w:b/>
+        </w:rPr>
+        <w:t>menos de 5 avaliações</w:t>
+      </w:r>
+      <w:r>
+        <w:t xml:space="preserve"> no período não tem a nota mostrada e recebe a média do restaurante: com tão poucas, daria para saber a nota que cada mesa deu. A avaliação continua anônima; ninguém vê quem avaliou.</w:t>
       </w:r>
     </w:p>
     <w:p>

</xml_diff>

<commit_message>
feat(alocacao): motivo de cada garçom na sugestão da RN03, com faixas e sem valores
- RegraDeDistribuicao.FaixasDeFaturamento: abaixo, na média ou acima da equipe do turno (±10%), ou sem histórico.
- FatoresDoTurno: os fatores da RN03 calculados num lugar só; vão para o Python e voltam como explicação.
- Sugestão, ajuste e confirmação trazem faixa, turnos desde praça de alto potencial e as praças de alto movimento;
  a consulta do turno só traz para Metre e Gerente.
- Tela do Metre mostra o motivo e a etiqueta Alto movimento; manual e D14.

Refs #235
</commit_message>
<xml_diff>
--- a/docs/manual-usuario/GASTRA_Manual_do_Usuario.docx
+++ b/docs/manual-usuario/GASTRA_Manual_do_Usuario.docx
@@ -1833,6 +1833,47 @@
     <w:p>
       <w:r>
         <w:t>"Praça de alto potencial" é a que fatura acima da média das praças com movimento. O segundo peso existe para o rodízio: sem ele, o mesmo garçom pegaria sempre a praça boa, e os outros nunca teriam chance de melhorar o próprio número.</w:t>
+      </w:r>
+    </w:p>
+    <w:p>
+      <w:r>
+        <w:t xml:space="preserve">Na tela, as praças de alto potencial levam a etiqueta </w:t>
+      </w:r>
+      <w:r>
+        <w:rPr>
+          <w:b/>
+        </w:rPr>
+        <w:t>Alto movimento</w:t>
+      </w:r>
+      <w:r>
+        <w:t xml:space="preserve">, e embaixo do nome de cada garçom aparece o motivo, por exemplo </w:t>
+      </w:r>
+      <w:r>
+        <w:rPr>
+          <w:i/>
+        </w:rPr>
+        <w:t>"Vendas abaixo da equipe · 3 turnos sem praça de alto movimento"</w:t>
+      </w:r>
+      <w:r>
+        <w:t xml:space="preserve">. As vendas aparecem só como </w:t>
+      </w:r>
+      <w:r>
+        <w:rPr>
+          <w:b/>
+        </w:rPr>
+        <w:t>faixa</w:t>
+      </w:r>
+      <w:r>
+        <w:t xml:space="preserve"> (abaixo, na média ou acima da equipe do turno, com 10% de tolerância), nunca em reais: o valor é indicador de desempenho, que só o Gerente consulta. Quem é novo na casa aparece como </w:t>
+      </w:r>
+      <w:r>
+        <w:rPr>
+          <w:i/>
+        </w:rPr>
+        <w:t>"Sem vendas nos últimos 30 dias"</w:t>
+      </w:r>
+      <w:r>
+        <w:t xml:space="preserve"> e, para a regra, conta como quem vendeu menos. O garçom que consulta o salão vê as praças, mas não o motivo dos colegas.</w:t>
       </w:r>
     </w:p>
     <w:p>

</xml_diff>

<commit_message>
feat(indicadores): perfis de consumo no BI do Gerente (RF09, RF10)
- GET /api/indicadores/perfis-consumo: busca os perfis no Python e troca os ids pelos nomes do cardápio.
  Sem perfis quando o serviço está fora (D3) ou o histórico ainda é simulado, com o motivo sinalizado.
- Painel de análises: seção de perfis, carregada à parte para não derrubar o resto.
- Arquitetura (5.2), manual (4.1) e mapeamento do relatório de testes.

Refs #240
</commit_message>
<xml_diff>
--- a/docs/manual-usuario/GASTRA_Manual_do_Usuario.docx
+++ b/docs/manual-usuario/GASTRA_Manual_do_Usuario.docx
@@ -2251,6 +2251,20 @@
       </w:r>
       <w:r>
         <w:t xml:space="preserve"> Não dá para ver a nota de uma mesa específica, nem o comentário, nem a nota &gt; por garçom. É escolha de projeto: a avaliação foi prometida anônima ao cliente, e uma nota ligada a uma &gt; comanda apontaria direto para quem atendeu aquela mesa. Se a casa decidir um dia acompanhar avaliação por &gt; garçom, é uma decisão nova, que muda o que se promete a quem avalia.</w:t>
+      </w:r>
+    </w:p>
+    <w:p>
+      <w:r>
+        <w:t xml:space="preserve">Mais abaixo ficam os </w:t>
+      </w:r>
+      <w:r>
+        <w:rPr>
+          <w:b/>
+        </w:rPr>
+        <w:t>perfis de consumo</w:t>
+      </w:r>
+      <w:r>
+        <w:t>: os tipos de mesa que o sistema encontrou no histórico do último ano, agrupando as comandas só pelo que foi pedido — por exemplo, um perfil em que quase toda mesa pede a porção infantil, o suco e uma sobremesa. Cada perfil mostra quantas mesas são daquele tipo e os itens que mais o caracterizam. É o mesmo agrupamento que a sugestão de pratos ao garçom usa para acertar mais. Enquanto o restaurante ainda não tem movimento suficiente (pelo menos 50 comandas com dois itens ou mais), a tela avisa em vez de mostrar perfis.</w:t>
       </w:r>
     </w:p>
     <w:p>

</xml_diff>